<commit_message>
Change colors on sidenav
</commit_message>
<xml_diff>
--- a/pdf/GwynHultquist_Resume_May2020.docx
+++ b/pdf/GwynHultquist_Resume_May2020.docx
@@ -73,7 +73,13 @@
         <w:rPr>
           <w:color w:val="666666"/>
         </w:rPr>
-        <w:t xml:space="preserve">| gwhultquist.com </w:t>
+        <w:t xml:space="preserve">| </w:t>
+      </w:r>
+      <w:r>
+        <w:rPr>
+          <w:color w:val="666666"/>
+        </w:rPr>
+        <w:t>ghultquist.github.io</w:t>
       </w:r>
     </w:p>
     <w:p>
@@ -827,13 +833,8 @@
       <w:r>
         <w:t xml:space="preserve"> </w:t>
       </w:r>
-      <w:proofErr w:type="spellStart"/>
-      <w:r>
-        <w:t>Katalon</w:t>
-      </w:r>
-      <w:proofErr w:type="spellEnd"/>
-      <w:r>
-        <w:t xml:space="preserve">, </w:t>
+      <w:r>
+        <w:t xml:space="preserve">Katalon, </w:t>
       </w:r>
       <w:r>
         <w:t>and Git</w:t>

</xml_diff>